<commit_message>
updated the Sales Analysis report
</commit_message>
<xml_diff>
--- a/Sales Analysis Project 2026/reports/Sales Analysis Report.docx
+++ b/Sales Analysis Project 2026/reports/Sales Analysis Report.docx
@@ -5,7 +5,12 @@
     <w:sdt>
       <w:sdtPr>
         <w:rPr>
+          <w:rFonts w:eastAsiaTheme="minorHAnsi"/>
+          <w:kern w:val="2"/>
           <w:sz w:val="2"/>
+          <w:szCs w:val="24"/>
+          <w:lang w:eastAsia="en-US"/>
+          <w14:ligatures w14:val="standardContextual"/>
         </w:rPr>
         <w:id w:val="-1551297088"/>
         <w:docPartObj>
@@ -15,12 +20,7 @@
       </w:sdtPr>
       <w:sdtEndPr>
         <w:rPr>
-          <w:rFonts w:eastAsiaTheme="minorHAnsi"/>
-          <w:kern w:val="2"/>
           <w:sz w:val="24"/>
-          <w:szCs w:val="24"/>
-          <w:lang w:eastAsia="en-US"/>
-          <w14:ligatures w14:val="standardContextual"/>
         </w:rPr>
       </w:sdtEndPr>
       <w:sdtContent>
@@ -891,6 +891,104 @@
             <w:rPr>
               <w:noProof/>
             </w:rPr>
+            <w:drawing>
+              <wp:anchor distT="0" distB="0" distL="114300" distR="114300" simplePos="0" relativeHeight="251664896" behindDoc="0" locked="0" layoutInCell="1" allowOverlap="1" wp14:anchorId="530957AA" wp14:editId="414BE9AE">
+                <wp:simplePos x="0" y="0"/>
+                <wp:positionH relativeFrom="margin">
+                  <wp:align>left</wp:align>
+                </wp:positionH>
+                <wp:positionV relativeFrom="paragraph">
+                  <wp:posOffset>1843405</wp:posOffset>
+                </wp:positionV>
+                <wp:extent cx="2316060" cy="674585"/>
+                <wp:effectExtent l="0" t="0" r="0" b="0"/>
+                <wp:wrapNone/>
+                <wp:docPr id="4" name="Image 4"/>
+                <wp:cNvGraphicFramePr/>
+                <a:graphic xmlns:a="http://schemas.openxmlformats.org/drawingml/2006/main">
+                  <a:graphicData uri="http://schemas.openxmlformats.org/drawingml/2006/picture">
+                    <pic:pic xmlns:pic="http://schemas.openxmlformats.org/drawingml/2006/picture">
+                      <pic:nvPicPr>
+                        <pic:cNvPr id="4" name="Image 4"/>
+                        <pic:cNvPicPr/>
+                      </pic:nvPicPr>
+                      <pic:blipFill>
+                        <a:blip r:embed="rId7" cstate="print"/>
+                        <a:stretch>
+                          <a:fillRect/>
+                        </a:stretch>
+                      </pic:blipFill>
+                      <pic:spPr>
+                        <a:xfrm>
+                          <a:off x="0" y="0"/>
+                          <a:ext cx="2316060" cy="674585"/>
+                        </a:xfrm>
+                        <a:prstGeom prst="rect">
+                          <a:avLst/>
+                        </a:prstGeom>
+                      </pic:spPr>
+                    </pic:pic>
+                  </a:graphicData>
+                </a:graphic>
+              </wp:anchor>
+            </w:drawing>
+          </w:r>
+          <w:r>
+            <w:rPr>
+              <w:noProof/>
+            </w:rPr>
+            <w:drawing>
+              <wp:anchor distT="0" distB="0" distL="114300" distR="114300" simplePos="0" relativeHeight="251662848" behindDoc="0" locked="0" layoutInCell="1" allowOverlap="1" wp14:anchorId="73272A60" wp14:editId="213C6C44">
+                <wp:simplePos x="0" y="0"/>
+                <wp:positionH relativeFrom="column">
+                  <wp:posOffset>4008120</wp:posOffset>
+                </wp:positionH>
+                <wp:positionV relativeFrom="paragraph">
+                  <wp:posOffset>7112000</wp:posOffset>
+                </wp:positionV>
+                <wp:extent cx="2278380" cy="1798320"/>
+                <wp:effectExtent l="0" t="0" r="0" b="0"/>
+                <wp:wrapNone/>
+                <wp:docPr id="3" name="Image 3"/>
+                <wp:cNvGraphicFramePr/>
+                <a:graphic xmlns:a="http://schemas.openxmlformats.org/drawingml/2006/main">
+                  <a:graphicData uri="http://schemas.openxmlformats.org/drawingml/2006/picture">
+                    <pic:pic xmlns:pic="http://schemas.openxmlformats.org/drawingml/2006/picture">
+                      <pic:nvPicPr>
+                        <pic:cNvPr id="3" name="Image 3"/>
+                        <pic:cNvPicPr/>
+                      </pic:nvPicPr>
+                      <pic:blipFill>
+                        <a:blip r:embed="rId8" cstate="print"/>
+                        <a:stretch>
+                          <a:fillRect/>
+                        </a:stretch>
+                      </pic:blipFill>
+                      <pic:spPr>
+                        <a:xfrm>
+                          <a:off x="0" y="0"/>
+                          <a:ext cx="2278380" cy="1798320"/>
+                        </a:xfrm>
+                        <a:prstGeom prst="rect">
+                          <a:avLst/>
+                        </a:prstGeom>
+                      </pic:spPr>
+                    </pic:pic>
+                  </a:graphicData>
+                </a:graphic>
+                <wp14:sizeRelH relativeFrom="margin">
+                  <wp14:pctWidth>0</wp14:pctWidth>
+                </wp14:sizeRelH>
+                <wp14:sizeRelV relativeFrom="margin">
+                  <wp14:pctHeight>0</wp14:pctHeight>
+                </wp14:sizeRelV>
+              </wp:anchor>
+            </w:drawing>
+          </w:r>
+          <w:r>
+            <w:rPr>
+              <w:noProof/>
+            </w:rPr>
             <mc:AlternateContent>
               <mc:Choice Requires="wps">
                 <w:drawing>
@@ -1133,12 +1231,16 @@
         <w:rPr>
           <w:b/>
           <w:bCs/>
-        </w:rPr>
-      </w:pPr>
-      <w:r>
-        <w:rPr>
-          <w:b/>
-          <w:bCs/>
+          <w:sz w:val="28"/>
+          <w:szCs w:val="28"/>
+        </w:rPr>
+      </w:pPr>
+      <w:r>
+        <w:rPr>
+          <w:b/>
+          <w:bCs/>
+          <w:sz w:val="28"/>
+          <w:szCs w:val="28"/>
         </w:rPr>
         <w:t>Objectives</w:t>
       </w:r>
@@ -1150,10 +1252,18 @@
     </w:p>
     <w:p/>
     <w:p>
-      <w:r>
-        <w:rPr>
-          <w:b/>
-          <w:bCs/>
+      <w:pPr>
+        <w:rPr>
+          <w:sz w:val="28"/>
+          <w:szCs w:val="28"/>
+        </w:rPr>
+      </w:pPr>
+      <w:r>
+        <w:rPr>
+          <w:b/>
+          <w:bCs/>
+          <w:sz w:val="28"/>
+          <w:szCs w:val="28"/>
         </w:rPr>
         <w:t>Executive Summary</w:t>
       </w:r>
@@ -1203,8 +1313,71 @@
             <w:tcW w:w="3005" w:type="dxa"/>
           </w:tcPr>
           <w:p>
-            <w:r>
+            <w:pPr>
+              <w:rPr>
+                <w:b/>
+                <w:bCs/>
+              </w:rPr>
+            </w:pPr>
+            <w:r>
+              <w:rPr>
+                <w:b/>
+                <w:bCs/>
+              </w:rPr>
               <w:t>Metric</w:t>
+            </w:r>
+          </w:p>
+        </w:tc>
+        <w:tc>
+          <w:tcPr>
+            <w:tcW w:w="3005" w:type="dxa"/>
+          </w:tcPr>
+          <w:p>
+            <w:pPr>
+              <w:ind w:firstLine="720"/>
+              <w:rPr>
+                <w:b/>
+                <w:bCs/>
+              </w:rPr>
+            </w:pPr>
+            <w:r>
+              <w:rPr>
+                <w:b/>
+                <w:bCs/>
+              </w:rPr>
+              <w:t>Top Performer</w:t>
+            </w:r>
+          </w:p>
+        </w:tc>
+        <w:tc>
+          <w:tcPr>
+            <w:tcW w:w="3006" w:type="dxa"/>
+          </w:tcPr>
+          <w:p>
+            <w:pPr>
+              <w:rPr>
+                <w:b/>
+                <w:bCs/>
+              </w:rPr>
+            </w:pPr>
+            <w:r>
+              <w:rPr>
+                <w:b/>
+                <w:bCs/>
+              </w:rPr>
+              <w:t>Key findings</w:t>
+            </w:r>
+          </w:p>
+        </w:tc>
+      </w:tr>
+      <w:tr>
+        <w:tc>
+          <w:tcPr>
+            <w:tcW w:w="3005" w:type="dxa"/>
+          </w:tcPr>
+          <w:p>
+            <w:r>
+              <w:t>Best Region</w:t>
             </w:r>
           </w:p>
         </w:tc>
@@ -1217,7 +1390,7 @@
               <w:ind w:firstLine="720"/>
             </w:pPr>
             <w:r>
-              <w:t>Top Performer</w:t>
+              <w:t>East</w:t>
             </w:r>
           </w:p>
         </w:tc>
@@ -1227,7 +1400,7 @@
           </w:tcPr>
           <w:p>
             <w:r>
-              <w:t>Key findings</w:t>
+              <w:t xml:space="preserve">Has the highest revenue across all categories </w:t>
             </w:r>
           </w:p>
         </w:tc>
@@ -1239,7 +1412,7 @@
           </w:tcPr>
           <w:p>
             <w:r>
-              <w:t>Best Region</w:t>
+              <w:t xml:space="preserve">Top Product </w:t>
             </w:r>
           </w:p>
         </w:tc>
@@ -1252,7 +1425,7 @@
               <w:ind w:firstLine="720"/>
             </w:pPr>
             <w:r>
-              <w:t>North</w:t>
+              <w:t>Phone</w:t>
             </w:r>
           </w:p>
         </w:tc>
@@ -1262,7 +1435,7 @@
           </w:tcPr>
           <w:p>
             <w:r>
-              <w:t xml:space="preserve">Has the highest revenue across all categories </w:t>
+              <w:t>Highest revenue generator in Electronics</w:t>
             </w:r>
           </w:p>
         </w:tc>
@@ -1274,7 +1447,7 @@
           </w:tcPr>
           <w:p>
             <w:r>
-              <w:t xml:space="preserve">Top Product </w:t>
+              <w:t>Best Performing Month</w:t>
             </w:r>
           </w:p>
         </w:tc>
@@ -1287,7 +1460,7 @@
               <w:ind w:firstLine="720"/>
             </w:pPr>
             <w:r>
-              <w:t>Phone</w:t>
+              <w:t>April</w:t>
             </w:r>
           </w:p>
         </w:tc>
@@ -1297,7 +1470,7 @@
           </w:tcPr>
           <w:p>
             <w:r>
-              <w:t>Highest revenue generator in Electronics</w:t>
+              <w:t>Best revenue generated</w:t>
             </w:r>
           </w:p>
         </w:tc>
@@ -1309,7 +1482,7 @@
           </w:tcPr>
           <w:p>
             <w:r>
-              <w:t>Best Performing Month</w:t>
+              <w:t>Top Salesperson</w:t>
             </w:r>
           </w:p>
         </w:tc>
@@ -1322,7 +1495,7 @@
               <w:ind w:firstLine="720"/>
             </w:pPr>
             <w:r>
-              <w:t>April</w:t>
+              <w:t>David</w:t>
             </w:r>
           </w:p>
         </w:tc>
@@ -1332,39 +1505,13 @@
           </w:tcPr>
           <w:p>
             <w:r>
-              <w:t>Best revenue generated</w:t>
-            </w:r>
-          </w:p>
-        </w:tc>
-      </w:tr>
-      <w:tr>
-        <w:tc>
-          <w:tcPr>
-            <w:tcW w:w="3005" w:type="dxa"/>
-          </w:tcPr>
-          <w:p>
-            <w:r>
-              <w:t>Top Salesperson</w:t>
-            </w:r>
-          </w:p>
-        </w:tc>
-        <w:tc>
-          <w:tcPr>
-            <w:tcW w:w="3005" w:type="dxa"/>
-          </w:tcPr>
-          <w:p>
-            <w:pPr>
-              <w:ind w:firstLine="720"/>
-            </w:pPr>
-          </w:p>
-        </w:tc>
-        <w:tc>
-          <w:tcPr>
-            <w:tcW w:w="3006" w:type="dxa"/>
-          </w:tcPr>
-          <w:p>
-            <w:r>
-              <w:t>Leading performer in the North region</w:t>
+              <w:t xml:space="preserve">Leading performer in the </w:t>
+            </w:r>
+            <w:r>
+              <w:t>East</w:t>
+            </w:r>
+            <w:r>
+              <w:t xml:space="preserve"> region</w:t>
             </w:r>
           </w:p>
         </w:tc>
@@ -1376,12 +1523,16 @@
         <w:rPr>
           <w:b/>
           <w:bCs/>
-        </w:rPr>
-      </w:pPr>
-      <w:r>
-        <w:rPr>
-          <w:b/>
-          <w:bCs/>
+          <w:sz w:val="28"/>
+          <w:szCs w:val="28"/>
+        </w:rPr>
+      </w:pPr>
+      <w:r>
+        <w:rPr>
+          <w:b/>
+          <w:bCs/>
+          <w:sz w:val="28"/>
+          <w:szCs w:val="28"/>
         </w:rPr>
         <w:t>Data Processing Methodology</w:t>
       </w:r>
@@ -1430,7 +1581,7 @@
                     <pic:cNvPicPr/>
                   </pic:nvPicPr>
                   <pic:blipFill>
-                    <a:blip r:embed="rId7">
+                    <a:blip r:embed="rId9">
                       <a:extLst>
                         <a:ext uri="{28A0092B-C50C-407E-A947-70E740481C1C}">
                           <a14:useLocalDpi xmlns:a14="http://schemas.microsoft.com/office/drawing/2010/main" val="0"/>
@@ -1463,20 +1614,26 @@
         <w:rPr>
           <w:b/>
           <w:bCs/>
-        </w:rPr>
-      </w:pPr>
-    </w:p>
-    <w:p>
-      <w:pPr>
-        <w:rPr>
-          <w:b/>
-          <w:bCs/>
-        </w:rPr>
-      </w:pPr>
-      <w:r>
-        <w:rPr>
-          <w:b/>
-          <w:bCs/>
+          <w:sz w:val="28"/>
+          <w:szCs w:val="28"/>
+        </w:rPr>
+      </w:pPr>
+    </w:p>
+    <w:p>
+      <w:pPr>
+        <w:rPr>
+          <w:b/>
+          <w:bCs/>
+          <w:sz w:val="28"/>
+          <w:szCs w:val="28"/>
+        </w:rPr>
+      </w:pPr>
+      <w:r>
+        <w:rPr>
+          <w:b/>
+          <w:bCs/>
+          <w:sz w:val="28"/>
+          <w:szCs w:val="28"/>
         </w:rPr>
         <w:t xml:space="preserve">Data Cleaning </w:t>
       </w:r>
@@ -1497,7 +1654,17 @@
             <w:tcW w:w="4508" w:type="dxa"/>
           </w:tcPr>
           <w:p>
-            <w:r>
+            <w:pPr>
+              <w:rPr>
+                <w:b/>
+                <w:bCs/>
+              </w:rPr>
+            </w:pPr>
+            <w:r>
+              <w:rPr>
+                <w:b/>
+                <w:bCs/>
+              </w:rPr>
               <w:t>Data Quality Issue</w:t>
             </w:r>
           </w:p>
@@ -1507,7 +1674,17 @@
             <w:tcW w:w="4508" w:type="dxa"/>
           </w:tcPr>
           <w:p>
-            <w:r>
+            <w:pPr>
+              <w:rPr>
+                <w:b/>
+                <w:bCs/>
+              </w:rPr>
+            </w:pPr>
+            <w:r>
+              <w:rPr>
+                <w:b/>
+                <w:bCs/>
+              </w:rPr>
               <w:t>Resolution Method</w:t>
             </w:r>
           </w:p>
@@ -1620,10 +1797,21 @@
             <w:r>
               <w:t>Removed c</w:t>
             </w:r>
+            <w:r>
+              <w:t xml:space="preserve">ompletely </w:t>
+            </w:r>
           </w:p>
         </w:tc>
       </w:tr>
     </w:tbl>
+    <w:p>
+      <w:pPr>
+        <w:rPr>
+          <w:b/>
+          <w:bCs/>
+        </w:rPr>
+      </w:pPr>
+    </w:p>
     <w:p>
       <w:pPr>
         <w:rPr>
@@ -1656,7 +1844,17 @@
             <w:tcW w:w="3126" w:type="dxa"/>
           </w:tcPr>
           <w:p>
-            <w:r>
+            <w:pPr>
+              <w:rPr>
+                <w:b/>
+                <w:bCs/>
+              </w:rPr>
+            </w:pPr>
+            <w:r>
+              <w:rPr>
+                <w:b/>
+                <w:bCs/>
+              </w:rPr>
               <w:t>New Field</w:t>
             </w:r>
           </w:p>
@@ -1668,8 +1866,16 @@
           <w:p>
             <w:pPr>
               <w:jc w:val="center"/>
+              <w:rPr>
+                <w:b/>
+                <w:bCs/>
+              </w:rPr>
             </w:pPr>
             <w:r>
+              <w:rPr>
+                <w:b/>
+                <w:bCs/>
+              </w:rPr>
               <w:t>Formula</w:t>
             </w:r>
           </w:p>
@@ -1679,7 +1885,17 @@
             <w:tcW w:w="2945" w:type="dxa"/>
           </w:tcPr>
           <w:p>
-            <w:r>
+            <w:pPr>
+              <w:rPr>
+                <w:b/>
+                <w:bCs/>
+              </w:rPr>
+            </w:pPr>
+            <w:r>
+              <w:rPr>
+                <w:b/>
+                <w:bCs/>
+              </w:rPr>
               <w:t>Business Value</w:t>
             </w:r>
           </w:p>
@@ -1756,12 +1972,16 @@
         <w:rPr>
           <w:b/>
           <w:bCs/>
-        </w:rPr>
-      </w:pPr>
-      <w:r>
-        <w:rPr>
-          <w:b/>
-          <w:bCs/>
+          <w:sz w:val="28"/>
+          <w:szCs w:val="28"/>
+        </w:rPr>
+      </w:pPr>
+      <w:r>
+        <w:rPr>
+          <w:b/>
+          <w:bCs/>
+          <w:sz w:val="28"/>
+          <w:szCs w:val="28"/>
         </w:rPr>
         <w:t>Business Analysis Findings</w:t>
       </w:r>
@@ -1835,7 +2055,7 @@
                     <pic:cNvPicPr/>
                   </pic:nvPicPr>
                   <pic:blipFill>
-                    <a:blip r:embed="rId8">
+                    <a:blip r:embed="rId10">
                       <a:extLst>
                         <a:ext uri="{28A0092B-C50C-407E-A947-70E740481C1C}">
                           <a14:useLocalDpi xmlns:a14="http://schemas.microsoft.com/office/drawing/2010/main" val="0"/>
@@ -1873,6 +2093,7 @@
           <w:b/>
           <w:bCs/>
         </w:rPr>
+        <w:lastRenderedPageBreak/>
         <w:t>Analysis:</w:t>
       </w:r>
       <w:r>
@@ -1896,7 +2117,6 @@
           <w:b/>
           <w:bCs/>
         </w:rPr>
-        <w:lastRenderedPageBreak/>
         <w:t>Business Implication:</w:t>
       </w:r>
       <w:r>
@@ -1924,12 +2144,16 @@
         <w:rPr>
           <w:b/>
           <w:bCs/>
-        </w:rPr>
-      </w:pPr>
-      <w:r>
-        <w:rPr>
-          <w:b/>
-          <w:bCs/>
+          <w:sz w:val="28"/>
+          <w:szCs w:val="28"/>
+        </w:rPr>
+      </w:pPr>
+      <w:r>
+        <w:rPr>
+          <w:b/>
+          <w:bCs/>
+          <w:sz w:val="28"/>
+          <w:szCs w:val="28"/>
         </w:rPr>
         <w:t>Product Performance Analysis</w:t>
       </w:r>
@@ -1977,7 +2201,7 @@
                     <pic:cNvPicPr/>
                   </pic:nvPicPr>
                   <pic:blipFill>
-                    <a:blip r:embed="rId9">
+                    <a:blip r:embed="rId11">
                       <a:extLst>
                         <a:ext uri="{28A0092B-C50C-407E-A947-70E740481C1C}">
                           <a14:useLocalDpi xmlns:a14="http://schemas.microsoft.com/office/drawing/2010/main" val="0"/>
@@ -2043,13 +2267,7 @@
         <w:t>Business Implication:</w:t>
       </w:r>
       <w:r>
-        <w:t xml:space="preserve"> Inventory and marketing budgets should be allocated proportionally to revenue contribution, with Electronics receiving </w:t>
-      </w:r>
-      <w:r>
-        <w:t>most</w:t>
-      </w:r>
-      <w:r>
-        <w:t xml:space="preserve"> resources.</w:t>
+        <w:t> Inventory and marketing budgets should be allocated proportionally to revenue contribution, with Electronics receiving most resources.</w:t>
       </w:r>
     </w:p>
     <w:p>
@@ -2067,12 +2285,16 @@
         <w:rPr>
           <w:b/>
           <w:bCs/>
-        </w:rPr>
-      </w:pPr>
-      <w:r>
-        <w:rPr>
-          <w:b/>
-          <w:bCs/>
+          <w:sz w:val="28"/>
+          <w:szCs w:val="28"/>
+        </w:rPr>
+      </w:pPr>
+      <w:r>
+        <w:rPr>
+          <w:b/>
+          <w:bCs/>
+          <w:sz w:val="28"/>
+          <w:szCs w:val="28"/>
         </w:rPr>
         <w:t>Sales Trend Analysis</w:t>
       </w:r>
@@ -2121,7 +2343,7 @@
                     <pic:cNvPicPr/>
                   </pic:nvPicPr>
                   <pic:blipFill>
-                    <a:blip r:embed="rId10">
+                    <a:blip r:embed="rId12">
                       <a:extLst>
                         <a:ext uri="{28A0092B-C50C-407E-A947-70E740481C1C}">
                           <a14:useLocalDpi xmlns:a14="http://schemas.microsoft.com/office/drawing/2010/main" val="0"/>
@@ -2172,18 +2394,29 @@
         <w:t> The factors driving the March growth should be investigated and potentially replicated in other months. If seasonal, inventory should be increased ahead of future March periods.</w:t>
       </w:r>
     </w:p>
-    <w:p/>
-    <w:p>
-      <w:pPr>
-        <w:rPr>
-          <w:b/>
-          <w:bCs/>
-        </w:rPr>
-      </w:pPr>
-      <w:r>
-        <w:rPr>
-          <w:b/>
-          <w:bCs/>
+    <w:p>
+      <w:pPr>
+        <w:rPr>
+          <w:sz w:val="28"/>
+          <w:szCs w:val="28"/>
+        </w:rPr>
+      </w:pPr>
+    </w:p>
+    <w:p>
+      <w:pPr>
+        <w:rPr>
+          <w:b/>
+          <w:bCs/>
+          <w:sz w:val="28"/>
+          <w:szCs w:val="28"/>
+        </w:rPr>
+      </w:pPr>
+      <w:r>
+        <w:rPr>
+          <w:b/>
+          <w:bCs/>
+          <w:sz w:val="28"/>
+          <w:szCs w:val="28"/>
         </w:rPr>
         <w:t>Salesperson Performance Analysis</w:t>
       </w:r>
@@ -2226,6 +2459,7 @@
         <w:rPr>
           <w:noProof/>
         </w:rPr>
+        <w:lastRenderedPageBreak/>
         <w:drawing>
           <wp:inline distT="0" distB="0" distL="0" distR="0" wp14:anchorId="3BB18B9C" wp14:editId="5DCB8830">
             <wp:extent cx="5731510" cy="2817495"/>
@@ -2242,7 +2476,7 @@
                     <pic:cNvPicPr/>
                   </pic:nvPicPr>
                   <pic:blipFill>
-                    <a:blip r:embed="rId11">
+                    <a:blip r:embed="rId13">
                       <a:extLst>
                         <a:ext uri="{28A0092B-C50C-407E-A947-70E740481C1C}">
                           <a14:useLocalDpi xmlns:a14="http://schemas.microsoft.com/office/drawing/2010/main" val="0"/>
@@ -2275,7 +2509,6 @@
           <w:b/>
           <w:bCs/>
         </w:rPr>
-        <w:lastRenderedPageBreak/>
         <w:t>Analysis:</w:t>
       </w:r>
       <w:r>
@@ -2318,12 +2551,16 @@
         <w:rPr>
           <w:b/>
           <w:bCs/>
-        </w:rPr>
-      </w:pPr>
-      <w:r>
-        <w:rPr>
-          <w:b/>
-          <w:bCs/>
+          <w:sz w:val="28"/>
+          <w:szCs w:val="28"/>
+        </w:rPr>
+      </w:pPr>
+      <w:r>
+        <w:rPr>
+          <w:b/>
+          <w:bCs/>
+          <w:sz w:val="28"/>
+          <w:szCs w:val="28"/>
         </w:rPr>
         <w:t>Actionable Business Recommendations</w:t>
       </w:r>
@@ -2333,6 +2570,16 @@
         <w:rPr>
           <w:b/>
           <w:bCs/>
+          <w:sz w:val="28"/>
+          <w:szCs w:val="28"/>
+        </w:rPr>
+      </w:pPr>
+    </w:p>
+    <w:p>
+      <w:pPr>
+        <w:rPr>
+          <w:b/>
+          <w:bCs/>
         </w:rPr>
       </w:pPr>
       <w:r>
@@ -2426,13 +2673,7 @@
         <w:t>Rationale:</w:t>
       </w:r>
       <w:r>
-        <w:t xml:space="preserve"> Electronics (specifically Phones) drives </w:t>
-      </w:r>
-      <w:r>
-        <w:t>most of the</w:t>
-      </w:r>
-      <w:r>
-        <w:t xml:space="preserve"> revenue. Resources should be allocated proportionally to revenue contribution.</w:t>
+        <w:t> Electronics (specifically Phones) drives most of the revenue. Resources should be allocated proportionally to revenue contribution.</w:t>
       </w:r>
     </w:p>
     <w:p>
@@ -2444,7 +2685,13 @@
         <w:t>Success Metric:</w:t>
       </w:r>
       <w:r>
-        <w:t> Electronics revenue increase of 15% next quarter; clear decision on Furniture line continuation.</w:t>
+        <w:t> Electronics revenue increase of 15% next quarter</w:t>
+      </w:r>
+      <w:r>
+        <w:t xml:space="preserve"> </w:t>
+      </w:r>
+      <w:r>
+        <w:t>clear decision on Furniture line continuation.</w:t>
       </w:r>
     </w:p>
     <w:p/>
@@ -2570,7 +2817,6 @@
           <w:b/>
           <w:bCs/>
         </w:rPr>
-        <w:lastRenderedPageBreak/>
         <w:t>Provides</w:t>
       </w:r>
       <w:r>
@@ -2651,7 +2897,17 @@
             <w:tcW w:w="3005" w:type="dxa"/>
           </w:tcPr>
           <w:p>
-            <w:r>
+            <w:pPr>
+              <w:rPr>
+                <w:b/>
+                <w:bCs/>
+              </w:rPr>
+            </w:pPr>
+            <w:r>
+              <w:rPr>
+                <w:b/>
+                <w:bCs/>
+              </w:rPr>
               <w:t>Component</w:t>
             </w:r>
           </w:p>
@@ -2661,7 +2917,17 @@
             <w:tcW w:w="3005" w:type="dxa"/>
           </w:tcPr>
           <w:p>
-            <w:r>
+            <w:pPr>
+              <w:rPr>
+                <w:b/>
+                <w:bCs/>
+              </w:rPr>
+            </w:pPr>
+            <w:r>
+              <w:rPr>
+                <w:b/>
+                <w:bCs/>
+              </w:rPr>
               <w:t>Technology</w:t>
             </w:r>
           </w:p>
@@ -2671,7 +2937,17 @@
             <w:tcW w:w="3006" w:type="dxa"/>
           </w:tcPr>
           <w:p>
-            <w:r>
+            <w:pPr>
+              <w:rPr>
+                <w:b/>
+                <w:bCs/>
+              </w:rPr>
+            </w:pPr>
+            <w:r>
+              <w:rPr>
+                <w:b/>
+                <w:bCs/>
+              </w:rPr>
               <w:t>Version</w:t>
             </w:r>
           </w:p>
@@ -2902,7 +3178,17 @@
             <w:tcW w:w="4508" w:type="dxa"/>
           </w:tcPr>
           <w:p>
-            <w:r>
+            <w:pPr>
+              <w:rPr>
+                <w:b/>
+                <w:bCs/>
+              </w:rPr>
+            </w:pPr>
+            <w:r>
+              <w:rPr>
+                <w:b/>
+                <w:bCs/>
+              </w:rPr>
               <w:t>Term</w:t>
             </w:r>
           </w:p>
@@ -2912,7 +3198,17 @@
             <w:tcW w:w="4508" w:type="dxa"/>
           </w:tcPr>
           <w:p>
-            <w:r>
+            <w:pPr>
+              <w:rPr>
+                <w:b/>
+                <w:bCs/>
+              </w:rPr>
+            </w:pPr>
+            <w:r>
+              <w:rPr>
+                <w:b/>
+                <w:bCs/>
+              </w:rPr>
               <w:t>Definition</w:t>
             </w:r>
           </w:p>
@@ -2948,6 +3244,7 @@
           <w:p>
             <w:proofErr w:type="spellStart"/>
             <w:r>
+              <w:lastRenderedPageBreak/>
               <w:t>venv</w:t>
             </w:r>
             <w:proofErr w:type="spellEnd"/>
@@ -2970,7 +3267,6 @@
         <w:br w:type="page"/>
       </w:r>
     </w:p>
-    <w:p/>
     <w:sectPr>
       <w:pgSz w:w="11906" w:h="16838"/>
       <w:pgMar w:top="1440" w:right="1440" w:bottom="1440" w:left="1440" w:header="708" w:footer="708" w:gutter="0"/>
@@ -3844,6 +4140,7 @@
   <w:style w:type="character" w:default="1" w:styleId="DefaultParagraphFont">
     <w:name w:val="Default Paragraph Font"/>
     <w:uiPriority w:val="1"/>
+    <w:semiHidden/>
     <w:unhideWhenUsed/>
   </w:style>
   <w:style w:type="table" w:default="1" w:styleId="TableNormal">

</xml_diff>

<commit_message>
updated the Sales Analysis excel
</commit_message>
<xml_diff>
--- a/Sales Analysis Project 2026/reports/Sales Analysis Report.docx
+++ b/Sales Analysis Project 2026/reports/Sales Analysis Report.docx
@@ -2446,6 +2446,12 @@
       </w:r>
     </w:p>
     <w:p>
+      <w:pPr>
+        <w:rPr>
+          <w:b/>
+          <w:bCs/>
+        </w:rPr>
+      </w:pPr>
       <w:r>
         <w:rPr>
           <w:b/>
@@ -2570,182 +2576,176 @@
         <w:rPr>
           <w:b/>
           <w:bCs/>
+        </w:rPr>
+      </w:pPr>
+      <w:r>
+        <w:rPr>
+          <w:b/>
+          <w:bCs/>
+        </w:rPr>
+        <w:t xml:space="preserve">Recommendation 1: Replicate </w:t>
+      </w:r>
+      <w:r>
+        <w:rPr>
+          <w:b/>
+          <w:bCs/>
+        </w:rPr>
+        <w:t>East</w:t>
+      </w:r>
+      <w:r>
+        <w:rPr>
+          <w:b/>
+          <w:bCs/>
+        </w:rPr>
+        <w:t xml:space="preserve"> Region Success Formula</w:t>
+      </w:r>
+    </w:p>
+    <w:p>
+      <w:r>
+        <w:rPr>
+          <w:b/>
+          <w:bCs/>
+        </w:rPr>
+        <w:t>Rationale:</w:t>
+      </w:r>
+      <w:r>
+        <w:t xml:space="preserve"> The </w:t>
+      </w:r>
+      <w:r>
+        <w:t>East</w:t>
+      </w:r>
+      <w:r>
+        <w:t xml:space="preserve"> region consistently outperforms other regions. Understanding and replicating their success factors is the fastest path to improving overall company performance.</w:t>
+      </w:r>
+    </w:p>
+    <w:p>
+      <w:r>
+        <w:rPr>
+          <w:b/>
+          <w:bCs/>
+        </w:rPr>
+        <w:t>Success Metric:</w:t>
+      </w:r>
+      <w:r>
+        <w:t> West region revenue increase of 20% within 3 months of implementation</w:t>
+      </w:r>
+    </w:p>
+    <w:p>
+      <w:pPr>
+        <w:rPr>
+          <w:b/>
+          <w:bCs/>
+        </w:rPr>
+      </w:pPr>
+      <w:r>
+        <w:rPr>
+          <w:b/>
+          <w:bCs/>
+        </w:rPr>
+        <w:t>Recommendation 2: Optimi</w:t>
+      </w:r>
+      <w:r>
+        <w:rPr>
+          <w:b/>
+          <w:bCs/>
+        </w:rPr>
+        <w:t>s</w:t>
+      </w:r>
+      <w:r>
+        <w:rPr>
+          <w:b/>
+          <w:bCs/>
+        </w:rPr>
+        <w:t>e Product Strategy</w:t>
+      </w:r>
+    </w:p>
+    <w:p>
+      <w:r>
+        <w:rPr>
+          <w:b/>
+          <w:bCs/>
+        </w:rPr>
+        <w:t>Rationale:</w:t>
+      </w:r>
+      <w:r>
+        <w:t> Electronics (specifically Phones) drives most of the revenue. Resources should be allocated proportionally to revenue contribution.</w:t>
+      </w:r>
+    </w:p>
+    <w:p>
+      <w:r>
+        <w:rPr>
+          <w:b/>
+          <w:bCs/>
+        </w:rPr>
+        <w:t>Success Metric:</w:t>
+      </w:r>
+      <w:r>
+        <w:t> Electronics revenue increase of 15% next quarter</w:t>
+      </w:r>
+      <w:r>
+        <w:t xml:space="preserve"> </w:t>
+      </w:r>
+      <w:r>
+        <w:t>clear decision on Furniture line continuation.</w:t>
+      </w:r>
+    </w:p>
+    <w:p/>
+    <w:p>
+      <w:pPr>
+        <w:rPr>
+          <w:b/>
+          <w:bCs/>
+        </w:rPr>
+      </w:pPr>
+      <w:r>
+        <w:rPr>
+          <w:b/>
+          <w:bCs/>
+        </w:rPr>
+        <w:t>Recommendation 3: Fix Data Quality at Source</w:t>
+      </w:r>
+    </w:p>
+    <w:p>
+      <w:r>
+        <w:rPr>
+          <w:b/>
+          <w:bCs/>
+        </w:rPr>
+        <w:lastRenderedPageBreak/>
+        <w:t>Rationale:</w:t>
+      </w:r>
+      <w:r>
+        <w:t> The presence of "Unknown" salesperson records prevents accurate performance tracking and may hide revenue attribution issues.</w:t>
+      </w:r>
+    </w:p>
+    <w:p>
+      <w:r>
+        <w:rPr>
+          <w:b/>
+          <w:bCs/>
+        </w:rPr>
+        <w:t>Success Metric:</w:t>
+      </w:r>
+      <w:r>
+        <w:t> Zero "Unknown" salesperson records in next month's data; 100% completion rate for all required fields.</w:t>
+      </w:r>
+    </w:p>
+    <w:p/>
+    <w:p>
+      <w:pPr>
+        <w:rPr>
+          <w:b/>
+          <w:bCs/>
           <w:sz w:val="28"/>
           <w:szCs w:val="28"/>
         </w:rPr>
       </w:pPr>
-    </w:p>
-    <w:p>
-      <w:pPr>
-        <w:rPr>
-          <w:b/>
-          <w:bCs/>
-        </w:rPr>
-      </w:pPr>
-      <w:r>
-        <w:rPr>
-          <w:b/>
-          <w:bCs/>
-        </w:rPr>
-        <w:t xml:space="preserve">Recommendation 1: Replicate </w:t>
-      </w:r>
-      <w:r>
-        <w:rPr>
-          <w:b/>
-          <w:bCs/>
-        </w:rPr>
-        <w:t>East</w:t>
-      </w:r>
-      <w:r>
-        <w:rPr>
-          <w:b/>
-          <w:bCs/>
-        </w:rPr>
-        <w:t xml:space="preserve"> Region Success Formula</w:t>
-      </w:r>
-    </w:p>
-    <w:p>
-      <w:r>
-        <w:rPr>
-          <w:b/>
-          <w:bCs/>
-        </w:rPr>
-        <w:t>Rationale:</w:t>
-      </w:r>
-      <w:r>
-        <w:t xml:space="preserve"> The </w:t>
-      </w:r>
-      <w:r>
-        <w:t>East</w:t>
-      </w:r>
-      <w:r>
-        <w:t xml:space="preserve"> region consistently outperforms other regions. Understanding and replicating their success factors is the fastest path to improving overall company performance.</w:t>
-      </w:r>
-    </w:p>
-    <w:p>
-      <w:r>
-        <w:rPr>
-          <w:b/>
-          <w:bCs/>
-        </w:rPr>
-        <w:t>Success Metric:</w:t>
-      </w:r>
-      <w:r>
-        <w:t> West region revenue increase of 20% within 3 months of implementation</w:t>
-      </w:r>
-    </w:p>
-    <w:p/>
-    <w:p>
-      <w:pPr>
-        <w:rPr>
-          <w:b/>
-          <w:bCs/>
-        </w:rPr>
-      </w:pPr>
-      <w:r>
-        <w:rPr>
-          <w:b/>
-          <w:bCs/>
-        </w:rPr>
-        <w:t>Recommendation 2: Optimi</w:t>
-      </w:r>
-      <w:r>
-        <w:rPr>
-          <w:b/>
-          <w:bCs/>
-        </w:rPr>
-        <w:t>s</w:t>
-      </w:r>
-      <w:r>
-        <w:rPr>
-          <w:b/>
-          <w:bCs/>
-        </w:rPr>
-        <w:t>e Product Strategy</w:t>
-      </w:r>
-    </w:p>
-    <w:p>
-      <w:r>
-        <w:rPr>
-          <w:b/>
-          <w:bCs/>
-        </w:rPr>
-        <w:t>Rationale:</w:t>
-      </w:r>
-      <w:r>
-        <w:t> Electronics (specifically Phones) drives most of the revenue. Resources should be allocated proportionally to revenue contribution.</w:t>
-      </w:r>
-    </w:p>
-    <w:p>
-      <w:r>
-        <w:rPr>
-          <w:b/>
-          <w:bCs/>
-        </w:rPr>
-        <w:t>Success Metric:</w:t>
-      </w:r>
-      <w:r>
-        <w:t> Electronics revenue increase of 15% next quarter</w:t>
-      </w:r>
-      <w:r>
-        <w:t xml:space="preserve"> </w:t>
-      </w:r>
-      <w:r>
-        <w:t>clear decision on Furniture line continuation.</w:t>
-      </w:r>
-    </w:p>
-    <w:p/>
-    <w:p>
-      <w:pPr>
-        <w:rPr>
-          <w:b/>
-          <w:bCs/>
-        </w:rPr>
-      </w:pPr>
-      <w:r>
-        <w:rPr>
-          <w:b/>
-          <w:bCs/>
-        </w:rPr>
-        <w:t>Recommendation 3: Fix Data Quality at Source</w:t>
-      </w:r>
-    </w:p>
-    <w:p>
-      <w:r>
-        <w:rPr>
-          <w:b/>
-          <w:bCs/>
-        </w:rPr>
-        <w:t>Rationale:</w:t>
-      </w:r>
-      <w:r>
-        <w:t> The presence of "Unknown" salesperson records prevents accurate performance tracking and may hide revenue attribution issues.</w:t>
-      </w:r>
-    </w:p>
-    <w:p>
-      <w:r>
-        <w:rPr>
-          <w:b/>
-          <w:bCs/>
-        </w:rPr>
-        <w:t>Success Metric:</w:t>
-      </w:r>
-      <w:r>
-        <w:t> Zero "Unknown" salesperson records in next month's data; 100% completion rate for all required fields.</w:t>
-      </w:r>
-    </w:p>
-    <w:p/>
-    <w:p>
-      <w:pPr>
-        <w:rPr>
-          <w:b/>
-          <w:bCs/>
-        </w:rPr>
-      </w:pPr>
-      <w:r>
-        <w:rPr>
-          <w:b/>
-          <w:bCs/>
+      <w:r>
+        <w:rPr>
+          <w:b/>
+          <w:bCs/>
+          <w:sz w:val="28"/>
+          <w:szCs w:val="28"/>
         </w:rPr>
         <w:t>Conclusion</w:t>
       </w:r>
@@ -3244,7 +3244,6 @@
           <w:p>
             <w:proofErr w:type="spellStart"/>
             <w:r>
-              <w:lastRenderedPageBreak/>
               <w:t>venv</w:t>
             </w:r>
             <w:proofErr w:type="spellEnd"/>

</xml_diff>